<commit_message>
fix: align grade labels and harden admin workflows
</commit_message>
<xml_diff>
--- a/docs/presentation/SANSUN学園_成績管理システム_加点資料.docx
+++ b/docs/presentation/SANSUN学園_成績管理システム_加点資料.docx
@@ -6294,7 +6294,7 @@
                 <w:color w:val="000000"/>
                 <w:sz w:val="18"/>
               </w:rPr>
-              <w:t>平常点</w:t>
+              <w:t>授業態度</w:t>
             </w:r>
           </w:p>
         </w:tc>
@@ -6423,7 +6423,7 @@
                 <w:color w:val="000000"/>
                 <w:sz w:val="18"/>
               </w:rPr>
-              <w:t>課題点</w:t>
+              <w:t>課題</w:t>
             </w:r>
           </w:p>
         </w:tc>
@@ -6994,7 +6994,7 @@
                 <w:color w:val="000000"/>
                 <w:sz w:val="18"/>
               </w:rPr>
-              <w:t>出席率・平常点・課題点の合計が100</w:t>
+              <w:t>出席率・授業態度・課題の合計が100</w:t>
             </w:r>
           </w:p>
         </w:tc>
@@ -7481,7 +7481,7 @@
           <w:color w:val="000000"/>
           <w:sz w:val="22"/>
         </w:rPr>
-        <w:t>評価は、出席率をそのまま、平常点・課題点を10倍して比重を掛け、100分率の整数分子として計算する。S/A/B/C/Fの境界は90/80/70/60点相当で、丸めずに判定する。</w:t>
+        <w:t>評価比重は出席率・授業態度・課題の各項目0〜100の整数で、合計を100にする。評価は、出席率をそのまま、授業態度・課題を10倍して比重を掛け、100分率の整数分子として計算する。秀/優/良/可/不可の境界は90/80/70/60点相当で、丸めずに判定する（内部コードはS/A/B/C/F）。成績は担当科目・学期ごとの保存単位を維持する。</w:t>
       </w:r>
     </w:p>
     <w:p>
@@ -10039,7 +10039,7 @@
                 <w:color w:val="000000"/>
                 <w:sz w:val="18"/>
               </w:rPr>
-              <w:t>年度4桁、学期1/2、学年1〜3、評価S/A/B/C/F</w:t>
+              <w:t>年度4桁、学期1/2、学年1〜3、評価秀/優/良/可/不可</w:t>
             </w:r>
           </w:p>
         </w:tc>
@@ -13562,7 +13562,7 @@
                 <w:color w:val="000000"/>
                 <w:sz w:val="18"/>
               </w:rPr>
-              <w:t>出席率・平常点・課題点を入力し「変更を保存」</w:t>
+              <w:t>出席率・授業態度・課題を入力し「変更を保存」</w:t>
             </w:r>
           </w:p>
         </w:tc>
@@ -13758,7 +13758,7 @@
                 <w:color w:val="000000"/>
                 <w:sz w:val="18"/>
               </w:rPr>
-              <w:t>出席率101、平常点0を送信</w:t>
+              <w:t>出席率101、授業態度0を送信</w:t>
             </w:r>
           </w:p>
         </w:tc>
@@ -13987,7 +13987,7 @@
                 <w:color w:val="000000"/>
                 <w:sz w:val="18"/>
               </w:rPr>
-              <w:t>100分率の得点とS/A/B/C/Fが再計算される</w:t>
+              <w:t>100分率の得点と秀/優/良/可/不可が再計算される</w:t>
             </w:r>
           </w:p>
         </w:tc>
@@ -16882,7 +16882,7 @@
           <w:color w:val="000000"/>
           <w:sz w:val="22"/>
         </w:rPr>
-        <w:t>出席率・平常点・課題点の比重を整数で入力する。</w:t>
+        <w:t>出席率・授業態度・課題の比重を整数で入力する。</w:t>
       </w:r>
     </w:p>
     <w:p>
@@ -16940,7 +16940,7 @@
           <w:color w:val="000000"/>
           <w:sz w:val="22"/>
         </w:rPr>
-        <w:t>学生ごとに「出席率」「平常点」「課題点」を入力する。</w:t>
+        <w:t>学生ごとに「出席率」「授業態度」「課題」を入力する。</w:t>
       </w:r>
     </w:p>
     <w:p>
@@ -16955,7 +16955,7 @@
           <w:color w:val="000000"/>
           <w:sz w:val="22"/>
         </w:rPr>
-        <w:t>出席率は0〜100、平常点・課題点は1〜10で入力する。未入力は空欄のままにできる。</w:t>
+        <w:t>出席率は0〜100、授業態度・課題は1〜10で入力する。未入力は空欄のままにできる。</w:t>
       </w:r>
     </w:p>
     <w:p>

</xml_diff>